<commit_message>
Ajustes de los hallazgos de repositorio
</commit_message>
<xml_diff>
--- a/fuentes/CFA2_63110192_DU.docx
+++ b/fuentes/CFA2_63110192_DU.docx
@@ -90,7 +90,7 @@
           </mc:Choice>
           <mc:Fallback>
             <w:pict>
-              <v:rect w14:anchorId="081AE8B1" id="Rectángulo 3" o:spid="_x0000_s1026" alt="&quot;&quot;" style="position:absolute;margin-left:-67.4pt;margin-top:31.4pt;width:622.3pt;height:204pt;z-index:-251656192;visibility:visible;mso-wrap-style:square;mso-width-percent:0;mso-height-percent:0;mso-wrap-distance-left:9pt;mso-wrap-distance-top:0;mso-wrap-distance-right:9pt;mso-wrap-distance-bottom:0;mso-position-horizontal:absolute;mso-position-horizontal-relative:text;mso-position-vertical:absolute;mso-position-vertical-relative:text;mso-width-percent:0;mso-height-percent:0;mso-width-relative:margin;mso-height-relative:margin;v-text-anchor:middle" o:gfxdata="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" fillcolor="#00314d" stroked="f" strokeweight="1pt"/>
+              <v:rect w14:anchorId="081AE8B1" id="Rectángulo 3" o:spid="_x0000_s1026" alt="&quot;&quot;" style="position:absolute;margin-left:-67.4pt;margin-top:31.4pt;width:622.3pt;height:204pt;z-index:-251656192;visibility:visible;mso-wrap-style:square;mso-width-percent:0;mso-height-percent:0;mso-wrap-distance-left:9pt;mso-wrap-distance-top:0;mso-wrap-distance-right:9pt;mso-wrap-distance-bottom:0;mso-position-horizontal:absolute;mso-position-horizontal-relative:text;mso-position-vertical:absolute;mso-position-vertical-relative:text;mso-width-percent:0;mso-height-percent:0;mso-width-relative:margin;mso-height-relative:margin;v-text-anchor:middle" o:gfxdata="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" fillcolor="#00314d" stroked="f" strokeweight="1pt"/>
             </w:pict>
           </mc:Fallback>
         </mc:AlternateContent>
@@ -252,6 +252,7 @@
                               </w:rPr>
                               <w:t xml:space="preserve"> del </w:t>
                             </w:r>
+                            <w:proofErr w:type="spellStart"/>
                             <w:r>
                               <w:rPr>
                                 <w:rStyle w:val="Extranjerismo"/>
@@ -259,6 +260,7 @@
                               </w:rPr>
                               <w:t>merchandising</w:t>
                             </w:r>
+                            <w:proofErr w:type="spellEnd"/>
                           </w:p>
                         </w:txbxContent>
                       </wps:txbx>
@@ -283,7 +285,7 @@
                 <v:stroke joinstyle="miter"/>
                 <v:path gradientshapeok="t" o:connecttype="rect"/>
               </v:shapetype>
-              <v:shape id="Cuadro de texto 2" o:spid="_x0000_s1026" type="#_x0000_t202" alt="&quot;&quot;" style="position:absolute;left:0;text-align:left;margin-left:-14.2pt;margin-top:33.5pt;width:488.95pt;height:143.25pt;z-index:251662336;visibility:visible;mso-wrap-style:square;mso-width-percent:0;mso-height-percent:0;mso-wrap-distance-left:9pt;mso-wrap-distance-top:3.6pt;mso-wrap-distance-right:9pt;mso-wrap-distance-bottom:3.6pt;mso-position-horizontal:absolute;mso-position-horizontal-relative:text;mso-position-vertical:absolute;mso-position-vertical-relative:text;mso-width-percent:0;mso-height-percent:0;mso-width-relative:margin;mso-height-relative:margin;v-text-anchor:top" o:gfxdata="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" filled="f" stroked="f">
+              <v:shape id="Cuadro de texto 2" o:spid="_x0000_s1026" type="#_x0000_t202" alt="&quot;&quot;" style="position:absolute;left:0;text-align:left;margin-left:-14.2pt;margin-top:33.5pt;width:488.95pt;height:143.25pt;z-index:251662336;visibility:visible;mso-wrap-style:square;mso-width-percent:0;mso-height-percent:0;mso-wrap-distance-left:9pt;mso-wrap-distance-top:3.6pt;mso-wrap-distance-right:9pt;mso-wrap-distance-bottom:3.6pt;mso-position-horizontal:absolute;mso-position-horizontal-relative:text;mso-position-vertical:absolute;mso-position-vertical-relative:text;mso-width-percent:0;mso-height-percent:0;mso-width-relative:margin;mso-height-relative:margin;v-text-anchor:top" o:gfxdata="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" filled="f" stroked="f">
                 <v:textbox>
                   <w:txbxContent>
                     <w:p>
@@ -306,6 +308,7 @@
                         </w:rPr>
                         <w:t xml:space="preserve"> del </w:t>
                       </w:r>
+                      <w:proofErr w:type="spellStart"/>
                       <w:r>
                         <w:rPr>
                           <w:rStyle w:val="Extranjerismo"/>
@@ -313,6 +316,7 @@
                         </w:rPr>
                         <w:t>merchandising</w:t>
                       </w:r>
+                      <w:proofErr w:type="spellEnd"/>
                     </w:p>
                   </w:txbxContent>
                 </v:textbox>
@@ -3290,10 +3294,10 @@
           <w:lang w:val="es-419" w:eastAsia="es-CO"/>
         </w:rPr>
         <w:drawing>
-          <wp:inline distT="0" distB="0" distL="0" distR="0" wp14:anchorId="27321BDF" wp14:editId="42ED473C">
+          <wp:inline distT="0" distB="0" distL="0" distR="0" wp14:anchorId="27321BDF" wp14:editId="53A50256">
             <wp:extent cx="5667154" cy="2673883"/>
             <wp:effectExtent l="0" t="0" r="0" b="6350"/>
-            <wp:docPr id="258328582" name="Imagen 1" descr="En la figura 1 se muestra  como es el layout tipo Grid (rejilla), desarrollado en un supermercado, supentienda o tienda."/>
+            <wp:docPr id="258328582" name="Imagen 1" descr="En la figura 1 se muestra  como es el layout tipo Grid (rejilla), desarrollado en un supermercado, supertienda o tienda."/>
             <wp:cNvGraphicFramePr>
               <a:graphicFrameLocks xmlns:a="http://schemas.openxmlformats.org/drawingml/2006/main" noChangeAspect="1"/>
             </wp:cNvGraphicFramePr>
@@ -3301,7 +3305,7 @@
               <a:graphicData uri="http://schemas.openxmlformats.org/drawingml/2006/picture">
                 <pic:pic xmlns:pic="http://schemas.openxmlformats.org/drawingml/2006/picture">
                   <pic:nvPicPr>
-                    <pic:cNvPr id="258328582" name="Imagen 1" descr="En la figura 1 se muestra  como es el layout tipo Grid (rejilla), desarrollado en un supermercado, supentienda o tienda."/>
+                    <pic:cNvPr id="258328582" name="Imagen 1" descr="En la figura 1 se muestra  como es el layout tipo Grid (rejilla), desarrollado en un supermercado, supertienda o tienda."/>
                     <pic:cNvPicPr/>
                   </pic:nvPicPr>
                   <pic:blipFill>
@@ -3741,15 +3745,54 @@
         </w:rPr>
         <w:t xml:space="preserve">Ver video: </w:t>
       </w:r>
-      <w:hyperlink r:id="rId17" w:history="1">
-        <w:r>
-          <w:rPr>
-            <w:rStyle w:val="Hipervnculo"/>
-            <w:lang w:val="es-419" w:eastAsia="es-CO"/>
-          </w:rPr>
-          <w:t>https://www.youtube.com/watch?v=kvg9VOYCISY</w:t>
-        </w:r>
-      </w:hyperlink>
+      <w:r>
+        <w:rPr>
+          <w:lang w:val="es-419" w:eastAsia="es-CO"/>
+        </w:rPr>
+        <w:fldChar w:fldCharType="begin"/>
+      </w:r>
+      <w:r>
+        <w:rPr>
+          <w:lang w:val="es-419" w:eastAsia="es-CO"/>
+        </w:rPr>
+        <w:instrText>HYPERLINK "</w:instrText>
+      </w:r>
+      <w:r>
+        <w:rPr>
+          <w:lang w:val="es-419" w:eastAsia="es-CO"/>
+        </w:rPr>
+        <w:instrText>https://www.youtube.com/watch?v=kvg9VOYCISY</w:instrText>
+      </w:r>
+      <w:r>
+        <w:rPr>
+          <w:lang w:val="es-419" w:eastAsia="es-CO"/>
+        </w:rPr>
+        <w:instrText>"</w:instrText>
+      </w:r>
+      <w:r>
+        <w:rPr>
+          <w:lang w:val="es-419" w:eastAsia="es-CO"/>
+        </w:rPr>
+      </w:r>
+      <w:r>
+        <w:rPr>
+          <w:lang w:val="es-419" w:eastAsia="es-CO"/>
+        </w:rPr>
+        <w:fldChar w:fldCharType="separate"/>
+      </w:r>
+      <w:r>
+        <w:rPr>
+          <w:rStyle w:val="Hipervnculo"/>
+          <w:lang w:val="es-419" w:eastAsia="es-CO"/>
+        </w:rPr>
+        <w:t>https://www.youtube.com/watch?v=kvg9VOYCISY</w:t>
+      </w:r>
+      <w:r>
+        <w:rPr>
+          <w:lang w:val="es-419" w:eastAsia="es-CO"/>
+        </w:rPr>
+        <w:fldChar w:fldCharType="end"/>
+      </w:r>
       <w:r>
         <w:rPr>
           <w:lang w:val="es-419" w:eastAsia="es-CO"/>
@@ -4583,7 +4626,7 @@
                     <pic:cNvPicPr/>
                   </pic:nvPicPr>
                   <pic:blipFill>
-                    <a:blip r:embed="rId18"/>
+                    <a:blip r:embed="rId17"/>
                     <a:stretch>
                       <a:fillRect/>
                     </a:stretch>
@@ -4728,7 +4771,7 @@
                     <pic:cNvPicPr/>
                   </pic:nvPicPr>
                   <pic:blipFill>
-                    <a:blip r:embed="rId19"/>
+                    <a:blip r:embed="rId18"/>
                     <a:stretch>
                       <a:fillRect/>
                     </a:stretch>
@@ -5091,7 +5134,7 @@
                     <pic:cNvPicPr/>
                   </pic:nvPicPr>
                   <pic:blipFill>
-                    <a:blip r:embed="rId20">
+                    <a:blip r:embed="rId19">
                       <a:extLst>
                         <a:ext uri="{28A0092B-C50C-407E-A947-70E740481C1C}">
                           <a14:useLocalDpi xmlns:a14="http://schemas.microsoft.com/office/drawing/2010/main" val="0"/>
@@ -5430,7 +5473,7 @@
       <w:r>
         <w:t xml:space="preserve"> y ventas impulsivas: </w:t>
       </w:r>
-      <w:hyperlink r:id="rId21" w:history="1">
+      <w:hyperlink r:id="rId20" w:history="1">
         <w:r>
           <w:rPr>
             <w:rStyle w:val="Hipervnculo"/>
@@ -9835,7 +9878,7 @@
                     <pic:cNvPicPr/>
                   </pic:nvPicPr>
                   <pic:blipFill>
-                    <a:blip r:embed="rId22">
+                    <a:blip r:embed="rId21">
                       <a:extLst>
                         <a:ext uri="{28A0092B-C50C-407E-A947-70E740481C1C}">
                           <a14:useLocalDpi xmlns:a14="http://schemas.microsoft.com/office/drawing/2010/main" val="0"/>
@@ -10618,7 +10661,7 @@
                 <w:lang w:val="es-419" w:eastAsia="es-CO"/>
               </w:rPr>
             </w:pPr>
-            <w:hyperlink r:id="rId23" w:history="1">
+            <w:hyperlink r:id="rId22" w:history="1">
               <w:r>
                 <w:rPr>
                   <w:rStyle w:val="Hipervnculo"/>
@@ -10734,7 +10777,7 @@
                 <w:lang w:val="es-419" w:eastAsia="es-CO"/>
               </w:rPr>
             </w:pPr>
-            <w:hyperlink r:id="rId24" w:tgtFrame="_new" w:history="1">
+            <w:hyperlink r:id="rId23" w:tgtFrame="_new" w:history="1">
               <w:r>
                 <w:rPr>
                   <w:rStyle w:val="Hipervnculo"/>
@@ -10853,7 +10896,7 @@
                 <w:lang w:val="es-419" w:eastAsia="es-CO"/>
               </w:rPr>
             </w:pPr>
-            <w:hyperlink r:id="rId25" w:history="1">
+            <w:hyperlink r:id="rId24" w:history="1">
               <w:r>
                 <w:rPr>
                   <w:rStyle w:val="Hipervnculo"/>
@@ -10982,7 +11025,7 @@
                 <w:lang w:val="es-419" w:eastAsia="es-CO"/>
               </w:rPr>
             </w:pPr>
-            <w:hyperlink r:id="rId26" w:tgtFrame="_new" w:history="1">
+            <w:hyperlink r:id="rId25" w:tgtFrame="_new" w:history="1">
               <w:r>
                 <w:rPr>
                   <w:rStyle w:val="Hipervnculo"/>
@@ -11022,7 +11065,7 @@
         </w:rPr>
         <w:t xml:space="preserve">Cámara de comercio de valencia (2022). Conceptos básicos de escaparatismo. </w:t>
       </w:r>
-      <w:hyperlink r:id="rId27" w:history="1">
+      <w:hyperlink r:id="rId26" w:history="1">
         <w:r>
           <w:rPr>
             <w:rStyle w:val="Hipervnculo"/>
@@ -11060,7 +11103,7 @@
         </w:rPr>
         <w:t xml:space="preserve"> (2016). Editorial Gustavo Gili. </w:t>
       </w:r>
-      <w:hyperlink r:id="rId28" w:history="1">
+      <w:hyperlink r:id="rId27" w:history="1">
         <w:r>
           <w:rPr>
             <w:rStyle w:val="Hipervnculo"/>
@@ -11112,7 +11155,7 @@
         </w:rPr>
         <w:t xml:space="preserve">Pearson. </w:t>
       </w:r>
-      <w:hyperlink r:id="rId29" w:history="1">
+      <w:hyperlink r:id="rId28" w:history="1">
         <w:r>
           <w:rPr>
             <w:rStyle w:val="Hipervnculo"/>
@@ -11150,7 +11193,7 @@
         </w:rPr>
         <w:t xml:space="preserve"> (2017). Fundación Universitaria del Área Andina. </w:t>
       </w:r>
-      <w:hyperlink r:id="rId30" w:history="1">
+      <w:hyperlink r:id="rId29" w:history="1">
         <w:r>
           <w:rPr>
             <w:rStyle w:val="Hipervnculo"/>
@@ -11188,7 +11231,7 @@
         </w:rPr>
         <w:t xml:space="preserve">(1.ª ed.). ECOE Ediciones. </w:t>
       </w:r>
-      <w:hyperlink r:id="rId31" w:history="1">
+      <w:hyperlink r:id="rId30" w:history="1">
         <w:r>
           <w:rPr>
             <w:rStyle w:val="Hipervnculo"/>
@@ -11233,7 +11276,7 @@
         </w:rPr>
         <w:tab/>
       </w:r>
-      <w:hyperlink r:id="rId32" w:history="1">
+      <w:hyperlink r:id="rId31" w:history="1">
         <w:r>
           <w:rPr>
             <w:rStyle w:val="Hipervnculo"/>
@@ -12348,8 +12391,8 @@
       </w:pPr>
     </w:p>
     <w:sectPr>
-      <w:headerReference w:type="default" r:id="rId33"/>
-      <w:footerReference w:type="default" r:id="rId34"/>
+      <w:headerReference w:type="default" r:id="rId32"/>
+      <w:footerReference w:type="default" r:id="rId33"/>
       <w:pgSz w:w="12240" w:h="15840"/>
       <w:pgMar w:top="1701" w:right="1134" w:bottom="1134" w:left="1134" w:header="709" w:footer="737" w:gutter="0"/>
       <w:pgNumType w:start="1"/>
@@ -12522,7 +12565,7 @@
                   <v:stroke joinstyle="miter"/>
                   <v:path gradientshapeok="t" o:connecttype="rect"/>
                 </v:shapetype>
-                <v:shape id="_x0000_s1027" type="#_x0000_t202" alt="&quot;&quot;" style="position:absolute;left:0;text-align:left;margin-left:16.1pt;margin-top:.65pt;width:455.15pt;height:41.4pt;z-index:251661312;visibility:visible;mso-wrap-style:square;mso-width-percent:0;mso-height-percent:0;mso-wrap-distance-left:9pt;mso-wrap-distance-top:3.6pt;mso-wrap-distance-right:9pt;mso-wrap-distance-bottom:3.6pt;mso-position-horizontal:absolute;mso-position-horizontal-relative:text;mso-position-vertical:absolute;mso-position-vertical-relative:text;mso-width-percent:0;mso-height-percent:0;mso-width-relative:margin;mso-height-relative:margin;v-text-anchor:top" o:gfxdata="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" stroked="f">
+                <v:shape id="_x0000_s1027" type="#_x0000_t202" alt="&quot;&quot;" style="position:absolute;left:0;text-align:left;margin-left:16.1pt;margin-top:.65pt;width:455.15pt;height:41.4pt;z-index:251661312;visibility:visible;mso-wrap-style:square;mso-width-percent:0;mso-height-percent:0;mso-wrap-distance-left:9pt;mso-wrap-distance-top:3.6pt;mso-wrap-distance-right:9pt;mso-wrap-distance-bottom:3.6pt;mso-position-horizontal:absolute;mso-position-horizontal-relative:text;mso-position-vertical:absolute;mso-position-vertical-relative:text;mso-width-percent:0;mso-height-percent:0;mso-width-relative:margin;mso-height-relative:margin;v-text-anchor:top" o:gfxdata="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" stroked="f">
                   <v:textbox>
                     <w:txbxContent>
                       <w:p>
@@ -25828,22 +25871,7 @@
 </file>
 
 <file path=customXml/itemProps2.xml><?xml version="1.0" encoding="utf-8"?>
-<ds:datastoreItem xmlns:ds="http://schemas.openxmlformats.org/officeDocument/2006/customXml" ds:itemID="{1DC2FCB1-759F-400B-8BB2-8C9C936250C6}">
-  <ds:schemaRefs>
-    <ds:schemaRef ds:uri="http://schemas.microsoft.com/office/2006/metadata/contentType"/>
-    <ds:schemaRef ds:uri="http://schemas.microsoft.com/office/2006/metadata/properties/metaAttributes"/>
-    <ds:schemaRef ds:uri="http://www.w3.org/2001/XMLSchema"/>
-    <ds:schemaRef ds:uri="http://schemas.microsoft.com/office/2006/metadata/properties"/>
-    <ds:schemaRef ds:uri="a70d3c18-0869-45a1-9f75-4b4b8f0f32be"/>
-    <ds:schemaRef ds:uri="adccf511-daff-4bcb-9072-914cedbf4c7e"/>
-    <ds:schemaRef ds:uri="http://schemas.microsoft.com/office/2006/documentManagement/types"/>
-    <ds:schemaRef ds:uri="http://schemas.microsoft.com/office/infopath/2007/PartnerControls"/>
-    <ds:schemaRef ds:uri="http://schemas.openxmlformats.org/package/2006/metadata/core-properties"/>
-    <ds:schemaRef ds:uri="http://purl.org/dc/elements/1.1/"/>
-    <ds:schemaRef ds:uri="http://purl.org/dc/terms/"/>
-    <ds:schemaRef ds:uri="http://schemas.microsoft.com/internal/obd"/>
-  </ds:schemaRefs>
-</ds:datastoreItem>
+<ds:datastoreItem xmlns:ds="http://schemas.openxmlformats.org/officeDocument/2006/customXml" ds:itemID="{058AF67C-7AEE-4F51-953F-0ED3A5BE8268}"/>
 </file>
 
 <file path=customXml/itemProps3.xml><?xml version="1.0" encoding="utf-8"?>
@@ -25859,8 +25887,8 @@
   <ds:schemaRefs>
     <ds:schemaRef ds:uri="http://schemas.microsoft.com/office/2006/metadata/properties"/>
     <ds:schemaRef ds:uri="http://schemas.microsoft.com/office/infopath/2007/PartnerControls"/>
-    <ds:schemaRef ds:uri="adccf511-daff-4bcb-9072-914cedbf4c7e"/>
-    <ds:schemaRef ds:uri="a70d3c18-0869-45a1-9f75-4b4b8f0f32be"/>
+    <ds:schemaRef ds:uri="cb45339b-ced9-4d0d-8f64-77573914d53b"/>
+    <ds:schemaRef ds:uri="43a3ca16-9c26-4813-b83f-4aec9927b43f"/>
   </ds:schemaRefs>
 </ds:datastoreItem>
 </file>
</xml_diff>